<commit_message>
Add PDF version of the visa application pack
Rendered with Chromium from the Word pack (docx_to_html.py +
html_to_pdf.js). Spacing tightened so the motivation letter and the
cover letter each fit on a single page.

Co-Authored-By: Claude Opus 5.5 <noreply@anthropic.com>
Claude-Session: https://claude.ai/code/session_01V65qP6GbsGseVCeoryzkZe
</commit_message>
<xml_diff>
--- a/visa-dossier/Dossier_Visa_Espagne.docx
+++ b/visa-dossier/Dossier_Visa_Espagne.docx
@@ -46,7 +46,7 @@
     </w:p>
     <w:p>
       <w:pPr>
-        <w:spacing w:after="120" w:line="276"/>
+        <w:spacing w:after="100" w:line="259"/>
       </w:pPr>
       <w:r>
         <w:t xml:space="preserve">Applicant: </w:t>
@@ -60,7 +60,7 @@
     </w:p>
     <w:p>
       <w:pPr>
-        <w:spacing w:after="120" w:line="276"/>
+        <w:spacing w:after="100" w:line="259"/>
       </w:pPr>
       <w:r>
         <w:t xml:space="preserve">Prepared: 26 September 2026</w:t>
@@ -285,7 +285,7 @@
     </w:p>
     <w:p>
       <w:pPr>
-        <w:spacing w:after="120" w:line="276"/>
+        <w:spacing w:after="100" w:line="259"/>
       </w:pPr>
       <w:r>
         <w:t xml:space="preserve">I compared four sources: the embassy’s official requirements page, an agency’s checklist for Tunis, and two posts from the “BLS visa espagne TUNISIE” group written by people who went through the process (June–July 2026). Here is what they agree on, where they differ, and what that means for your file.</w:t>
@@ -836,7 +836,7 @@
     </w:p>
     <w:p>
       <w:pPr>
-        <w:spacing w:after="120" w:line="276"/>
+        <w:spacing w:after="100" w:line="259"/>
       </w:pPr>
       <w:r>
         <w:t xml:space="preserve">The group posts and the agency checklist were written for </w:t>
@@ -1636,7 +1636,7 @@
     </w:p>
     <w:p>
       <w:pPr>
-        <w:spacing w:after="120" w:line="276"/>
+        <w:spacing w:after="100" w:line="259"/>
       </w:pPr>
       <w:r>
         <w:t xml:space="preserve">Columns: </w:t>
@@ -6342,7 +6342,7 @@
     </w:p>
     <w:p>
       <w:pPr>
-        <w:spacing w:after="0" w:line="276"/>
+        <w:spacing w:after="0" w:line="259"/>
       </w:pPr>
       <w:r>
         <w:rPr>
@@ -6353,7 +6353,7 @@
     </w:p>
     <w:p>
       <w:pPr>
-        <w:spacing w:after="0" w:line="276"/>
+        <w:spacing w:after="0" w:line="259"/>
       </w:pPr>
       <w:r>
         <w:rPr>
@@ -6385,7 +6385,7 @@
     </w:p>
     <w:p>
       <w:pPr>
-        <w:spacing w:after="240" w:line="276"/>
+        <w:spacing w:after="160" w:line="259"/>
       </w:pPr>
       <w:r>
         <w:t xml:space="preserve">Pasaporte n.º </w:t>
@@ -6417,7 +6417,7 @@
     </w:p>
     <w:p>
       <w:pPr>
-        <w:spacing w:after="0" w:line="276"/>
+        <w:spacing w:after="0" w:line="259"/>
       </w:pPr>
       <w:r>
         <w:t xml:space="preserve">Sección Consular</w:t>
@@ -6425,7 +6425,7 @@
     </w:p>
     <w:p>
       <w:pPr>
-        <w:spacing w:after="240" w:line="276"/>
+        <w:spacing w:after="160" w:line="259"/>
       </w:pPr>
       <w:r>
         <w:t xml:space="preserve">Embajada de España en Túnez</w:t>
@@ -6433,7 +6433,7 @@
     </w:p>
     <w:p>
       <w:pPr>
-        <w:spacing w:after="240" w:line="276"/>
+        <w:spacing w:after="160" w:line="259"/>
         <w:jc w:val="right"/>
       </w:pPr>
       <w:r>
@@ -6466,7 +6466,7 @@
     </w:p>
     <w:p>
       <w:pPr>
-        <w:spacing w:after="200" w:line="276"/>
+        <w:spacing w:after="200" w:line="259"/>
       </w:pPr>
       <w:r>
         <w:rPr>
@@ -6478,7 +6478,7 @@
     </w:p>
     <w:p>
       <w:pPr>
-        <w:spacing w:after="120" w:line="276"/>
+        <w:spacing w:after="100" w:line="259"/>
       </w:pPr>
       <w:r>
         <w:t xml:space="preserve">Señoras y señores:</w:t>
@@ -6486,7 +6486,7 @@
     </w:p>
     <w:p>
       <w:pPr>
-        <w:spacing w:after="120" w:line="276"/>
+        <w:spacing w:after="100" w:line="259"/>
         <w:jc w:val="both"/>
       </w:pPr>
       <w:r>
@@ -6558,7 +6558,7 @@
     </w:p>
     <w:p>
       <w:pPr>
-        <w:spacing w:after="120" w:line="276"/>
+        <w:spacing w:after="100" w:line="259"/>
         <w:jc w:val="both"/>
       </w:pPr>
       <w:r>
@@ -6628,7 +6628,7 @@
     </w:p>
     <w:p>
       <w:pPr>
-        <w:spacing w:after="120" w:line="276"/>
+        <w:spacing w:after="100" w:line="259"/>
         <w:jc w:val="both"/>
       </w:pPr>
       <w:r>
@@ -6689,7 +6689,7 @@
     </w:p>
     <w:p>
       <w:pPr>
-        <w:spacing w:after="120" w:line="276"/>
+        <w:spacing w:after="100" w:line="259"/>
         <w:jc w:val="both"/>
       </w:pPr>
       <w:r>
@@ -6732,7 +6732,7 @@
     </w:p>
     <w:p>
       <w:pPr>
-        <w:spacing w:after="40" w:line="276"/>
+        <w:spacing w:after="40" w:line="259"/>
       </w:pPr>
       <w:r>
         <w:rPr>
@@ -6832,7 +6832,7 @@
     </w:p>
     <w:p>
       <w:pPr>
-        <w:spacing w:after="120" w:line="276"/>
+        <w:spacing w:after="100" w:line="259"/>
         <w:jc w:val="both"/>
       </w:pPr>
       <w:r>
@@ -6920,7 +6920,7 @@
     </w:p>
     <w:p>
       <w:pPr>
-        <w:spacing w:after="120" w:line="276"/>
+        <w:spacing w:after="100" w:line="259"/>
         <w:jc w:val="both"/>
       </w:pPr>
       <w:r>
@@ -6945,7 +6945,7 @@
     </w:p>
     <w:p>
       <w:pPr>
-        <w:spacing w:after="120" w:line="276"/>
+        <w:spacing w:after="100" w:line="259"/>
         <w:jc w:val="both"/>
       </w:pPr>
       <w:r>
@@ -6954,7 +6954,7 @@
     </w:p>
     <w:p>
       <w:pPr>
-        <w:spacing w:after="480" w:line="276"/>
+        <w:spacing w:after="360" w:line="259"/>
       </w:pPr>
       <w:r>
         <w:t xml:space="preserve">Atentamente,</w:t>
@@ -6962,7 +6962,7 @@
     </w:p>
     <w:p>
       <w:pPr>
-        <w:spacing w:after="0" w:line="276"/>
+        <w:spacing w:after="0" w:line="259"/>
       </w:pPr>
       <w:r>
         <w:rPr>
@@ -6973,7 +6973,7 @@
     </w:p>
     <w:p>
       <w:pPr>
-        <w:spacing w:after="120" w:line="276"/>
+        <w:spacing w:after="100" w:line="259"/>
       </w:pPr>
       <w:r>
         <w:rPr>
@@ -7015,7 +7015,7 @@
     </w:p>
     <w:p>
       <w:pPr>
-        <w:spacing w:after="0" w:line="276"/>
+        <w:spacing w:after="0" w:line="259"/>
       </w:pPr>
       <w:r>
         <w:rPr>
@@ -7026,7 +7026,7 @@
     </w:p>
     <w:p>
       <w:pPr>
-        <w:spacing w:after="0" w:line="276"/>
+        <w:spacing w:after="0" w:line="259"/>
       </w:pPr>
       <w:r>
         <w:rPr>
@@ -7058,7 +7058,7 @@
     </w:p>
     <w:p>
       <w:pPr>
-        <w:spacing w:after="240" w:line="276"/>
+        <w:spacing w:after="160" w:line="259"/>
       </w:pPr>
       <w:r>
         <w:t xml:space="preserve">Pasaporte n.º </w:t>
@@ -7090,7 +7090,7 @@
     </w:p>
     <w:p>
       <w:pPr>
-        <w:spacing w:after="0" w:line="276"/>
+        <w:spacing w:after="0" w:line="259"/>
       </w:pPr>
       <w:r>
         <w:t xml:space="preserve">Sección Consular</w:t>
@@ -7098,7 +7098,7 @@
     </w:p>
     <w:p>
       <w:pPr>
-        <w:spacing w:after="240" w:line="276"/>
+        <w:spacing w:after="160" w:line="259"/>
       </w:pPr>
       <w:r>
         <w:t xml:space="preserve">Embajada de España en Túnez</w:t>
@@ -7106,7 +7106,7 @@
     </w:p>
     <w:p>
       <w:pPr>
-        <w:spacing w:after="240" w:line="276"/>
+        <w:spacing w:after="160" w:line="259"/>
         <w:jc w:val="right"/>
       </w:pPr>
       <w:r>
@@ -7139,7 +7139,7 @@
     </w:p>
     <w:p>
       <w:pPr>
-        <w:spacing w:after="200" w:line="276"/>
+        <w:spacing w:after="200" w:line="259"/>
       </w:pPr>
       <w:r>
         <w:rPr>
@@ -7151,7 +7151,7 @@
     </w:p>
     <w:p>
       <w:pPr>
-        <w:spacing w:after="120" w:line="276"/>
+        <w:spacing w:after="100" w:line="259"/>
       </w:pPr>
       <w:r>
         <w:t xml:space="preserve">Señoras y señores:</w:t>
@@ -7159,7 +7159,7 @@
     </w:p>
     <w:p>
       <w:pPr>
-        <w:spacing w:after="120" w:line="276"/>
+        <w:spacing w:after="100" w:line="259"/>
         <w:jc w:val="both"/>
       </w:pPr>
       <w:r>
@@ -7195,7 +7195,7 @@
     </w:p>
     <w:p>
       <w:pPr>
-        <w:spacing w:after="40" w:line="276"/>
+        <w:spacing w:after="40" w:line="259"/>
       </w:pPr>
       <w:r>
         <w:rPr>
@@ -7452,7 +7452,7 @@
     </w:p>
     <w:p>
       <w:pPr>
-        <w:spacing w:after="40" w:line="276"/>
+        <w:spacing w:after="40" w:line="259"/>
       </w:pPr>
       <w:r>
         <w:rPr>
@@ -7542,7 +7542,7 @@
     </w:p>
     <w:p>
       <w:pPr>
-        <w:spacing w:after="120" w:line="276"/>
+        <w:spacing w:after="100" w:line="259"/>
       </w:pPr>
       <w:r>
         <w:t xml:space="preserve">Quedo a su disposición para cualquier aclaración, documentación adicional o entrevista.</w:t>
@@ -7550,7 +7550,7 @@
     </w:p>
     <w:p>
       <w:pPr>
-        <w:spacing w:after="480" w:line="276"/>
+        <w:spacing w:after="360" w:line="259"/>
       </w:pPr>
       <w:r>
         <w:t xml:space="preserve">Atentamente,</w:t>
@@ -7558,7 +7558,7 @@
     </w:p>
     <w:p>
       <w:pPr>
-        <w:spacing w:after="0" w:line="276"/>
+        <w:spacing w:after="0" w:line="259"/>
       </w:pPr>
       <w:r>
         <w:rPr>
@@ -7569,7 +7569,7 @@
     </w:p>
     <w:p>
       <w:pPr>
-        <w:spacing w:after="120" w:line="276"/>
+        <w:spacing w:after="100" w:line="259"/>
       </w:pPr>
       <w:r>
         <w:rPr>
@@ -7627,7 +7627,7 @@
     </w:p>
     <w:p>
       <w:pPr>
-        <w:spacing w:after="160" w:line="276"/>
+        <w:spacing w:after="160" w:line="259"/>
       </w:pPr>
       <w:r>
         <w:t xml:space="preserve">Je soussigné(e) </w:t>
@@ -7644,7 +7644,7 @@
     </w:p>
     <w:p>
       <w:pPr>
-        <w:spacing w:after="160" w:line="276"/>
+        <w:spacing w:after="160" w:line="259"/>
       </w:pPr>
       <w:r>
         <w:t xml:space="preserve">en qualité de </w:t>
@@ -7661,7 +7661,7 @@
     </w:p>
     <w:p>
       <w:pPr>
-        <w:spacing w:after="160" w:line="276"/>
+        <w:spacing w:after="160" w:line="259"/>
       </w:pPr>
       <w:r>
         <w:t xml:space="preserve">titulaire de la CIN n° </w:t>
@@ -7696,7 +7696,7 @@
     </w:p>
     <w:p>
       <w:pPr>
-        <w:spacing w:after="240" w:line="276"/>
+        <w:spacing w:after="240" w:line="259"/>
       </w:pPr>
       <w:r>
         <w:t xml:space="preserve">N° de téléphone : </w:t>
@@ -7713,7 +7713,7 @@
     </w:p>
     <w:p>
       <w:pPr>
-        <w:spacing w:after="240" w:line="276"/>
+        <w:spacing w:after="240" w:line="259"/>
         <w:jc w:val="both"/>
       </w:pPr>
       <w:r>
@@ -7722,7 +7722,7 @@
     </w:p>
     <w:p>
       <w:pPr>
-        <w:spacing w:after="160" w:line="276"/>
+        <w:spacing w:after="160" w:line="259"/>
       </w:pPr>
       <w:r>
         <w:t xml:space="preserve">mon fils / ma fille </w:t>
@@ -7748,7 +7748,7 @@
     </w:p>
     <w:p>
       <w:pPr>
-        <w:spacing w:after="240" w:line="276"/>
+        <w:spacing w:after="240" w:line="259"/>
       </w:pPr>
       <w:r>
         <w:t xml:space="preserve">titulaire du passeport tunisien sous le N° </w:t>
@@ -7765,7 +7765,7 @@
     </w:p>
     <w:p>
       <w:pPr>
-        <w:spacing w:after="240" w:line="276"/>
+        <w:spacing w:after="240" w:line="259"/>
         <w:jc w:val="both"/>
       </w:pPr>
       <w:r>
@@ -7792,7 +7792,7 @@
     </w:p>
     <w:p>
       <w:pPr>
-        <w:spacing w:after="240" w:line="276"/>
+        <w:spacing w:after="240" w:line="259"/>
         <w:jc w:val="both"/>
       </w:pPr>
       <w:r>
@@ -7810,7 +7810,7 @@
     </w:p>
     <w:p>
       <w:pPr>
-        <w:spacing w:after="480" w:line="276"/>
+        <w:spacing w:after="480" w:line="259"/>
         <w:jc w:val="both"/>
       </w:pPr>
       <w:r>
@@ -7855,7 +7855,7 @@
     </w:p>
     <w:p>
       <w:pPr>
-        <w:spacing w:after="720" w:line="276"/>
+        <w:spacing w:after="720" w:line="259"/>
         <w:jc w:val="right"/>
       </w:pPr>
       <w:r>
@@ -7879,7 +7879,7 @@
     </w:p>
     <w:p>
       <w:pPr>
-        <w:spacing w:after="120" w:line="276"/>
+        <w:spacing w:after="100" w:line="259"/>
       </w:pPr>
       <w:r>
         <w:t xml:space="preserve">Signature (à légaliser auprès de la Municipalité)</w:t>
@@ -7933,7 +7933,7 @@
     </w:p>
     <w:p>
       <w:pPr>
-        <w:spacing w:after="200" w:line="276"/>
+        <w:spacing w:after="200" w:line="259"/>
         <w:jc w:val="both"/>
       </w:pPr>
       <w:r>
@@ -7969,7 +7969,7 @@
     </w:p>
     <w:p>
       <w:pPr>
-        <w:spacing w:after="200" w:line="276"/>
+        <w:spacing w:after="200" w:line="259"/>
         <w:jc w:val="both"/>
       </w:pPr>
       <w:r>
@@ -8014,7 +8014,7 @@
     </w:p>
     <w:p>
       <w:pPr>
-        <w:spacing w:after="200" w:line="276"/>
+        <w:spacing w:after="200" w:line="259"/>
         <w:jc w:val="both"/>
       </w:pPr>
       <w:r>
@@ -8027,7 +8027,7 @@
     </w:p>
     <w:p>
       <w:pPr>
-        <w:spacing w:after="360" w:line="276"/>
+        <w:spacing w:after="360" w:line="259"/>
       </w:pPr>
       <w:r>
         <w:t xml:space="preserve">Certificat délivré à l’intéressé(e) pour servir et valoir ce que de droit.</w:t>
@@ -8035,7 +8035,7 @@
     </w:p>
     <w:p>
       <w:pPr>
-        <w:spacing w:after="480" w:line="276"/>
+        <w:spacing w:after="480" w:line="259"/>
         <w:jc w:val="right"/>
       </w:pPr>
       <w:r>
@@ -8059,7 +8059,7 @@
     </w:p>
     <w:p>
       <w:pPr>
-        <w:spacing w:after="120" w:line="276"/>
+        <w:spacing w:after="100" w:line="259"/>
       </w:pPr>
       <w:r>
         <w:t xml:space="preserve">Signature et cachet du médecin</w:t>
@@ -8098,7 +8098,7 @@
     </w:p>
     <w:p>
       <w:pPr>
-        <w:spacing w:after="120" w:line="276"/>
+        <w:spacing w:after="100" w:line="259"/>
       </w:pPr>
       <w:r>
         <w:rPr>
@@ -8128,7 +8128,7 @@
     </w:p>
     <w:p>
       <w:pPr>
-        <w:spacing w:after="120" w:line="276"/>
+        <w:spacing w:after="100" w:line="259"/>
       </w:pPr>
       <w:r>
         <w:t xml:space="preserve">Estimados señores:</w:t>
@@ -8136,7 +8136,7 @@
     </w:p>
     <w:p>
       <w:pPr>
-        <w:spacing w:after="120" w:line="276"/>
+        <w:spacing w:after="100" w:line="259"/>
         <w:jc w:val="both"/>
       </w:pPr>
       <w:r>
@@ -8290,7 +8290,7 @@
     </w:p>
     <w:p>
       <w:pPr>
-        <w:spacing w:after="120" w:line="276"/>
+        <w:spacing w:after="100" w:line="259"/>
       </w:pPr>
       <w:r>
         <w:t xml:space="preserve">Muchas gracias de antemano.</w:t>
@@ -8298,7 +8298,7 @@
     </w:p>
     <w:p>
       <w:pPr>
-        <w:spacing w:after="120" w:line="276"/>
+        <w:spacing w:after="120" w:line="259"/>
       </w:pPr>
       <w:r>
         <w:t xml:space="preserve">Un cordial saludo,</w:t>
@@ -8306,7 +8306,7 @@
     </w:p>
     <w:p>
       <w:pPr>
-        <w:spacing w:after="120" w:line="276"/>
+        <w:spacing w:after="100" w:line="259"/>
       </w:pPr>
       <w:r>
         <w:rPr>
@@ -8366,7 +8366,7 @@
     </w:p>
     <w:p>
       <w:pPr>
-        <w:spacing w:after="120" w:line="276"/>
+        <w:spacing w:after="100" w:line="259"/>
       </w:pPr>
       <w:r>
         <w:rPr>
@@ -8396,7 +8396,7 @@
     </w:p>
     <w:p>
       <w:pPr>
-        <w:spacing w:after="120" w:line="276"/>
+        <w:spacing w:after="100" w:line="259"/>
       </w:pPr>
       <w:r>
         <w:t xml:space="preserve">Madame, Monsieur,</w:t>
@@ -8404,7 +8404,7 @@
     </w:p>
     <w:p>
       <w:pPr>
-        <w:spacing w:after="120" w:line="276"/>
+        <w:spacing w:after="100" w:line="259"/>
         <w:jc w:val="both"/>
       </w:pPr>
       <w:r>
@@ -8458,7 +8458,7 @@
     </w:p>
     <w:p>
       <w:pPr>
-        <w:spacing w:after="120" w:line="276"/>
+        <w:spacing w:after="100" w:line="259"/>
         <w:jc w:val="both"/>
       </w:pPr>
       <w:r>
@@ -8467,7 +8467,7 @@
     </w:p>
     <w:p>
       <w:pPr>
-        <w:spacing w:after="120" w:line="276"/>
+        <w:spacing w:after="100" w:line="259"/>
       </w:pPr>
       <w:r>
         <w:t xml:space="preserve">Vous trouverez ci-joint mon passeport et ma lettre d’admission au format PDF.</w:t>
@@ -8475,7 +8475,7 @@
     </w:p>
     <w:p>
       <w:pPr>
-        <w:spacing w:after="120" w:line="276"/>
+        <w:spacing w:after="100" w:line="259"/>
       </w:pPr>
       <w:r>
         <w:t xml:space="preserve">Je vous remercie par avance et reste à votre disposition.</w:t>
@@ -8483,7 +8483,7 @@
     </w:p>
     <w:p>
       <w:pPr>
-        <w:spacing w:after="120" w:line="276"/>
+        <w:spacing w:after="120" w:line="259"/>
       </w:pPr>
       <w:r>
         <w:t xml:space="preserve">Cordialement,</w:t>
@@ -8491,7 +8491,7 @@
     </w:p>
     <w:p>
       <w:pPr>
-        <w:spacing w:after="120" w:line="276"/>
+        <w:spacing w:after="100" w:line="259"/>
       </w:pPr>
       <w:r>
         <w:rPr>
@@ -8520,7 +8520,7 @@
     </w:p>
     <w:p>
       <w:pPr>
-        <w:spacing w:after="120" w:line="276"/>
+        <w:spacing w:after="100" w:line="259"/>
       </w:pPr>
       <w:r>
         <w:rPr>
@@ -8554,7 +8554,7 @@
     </w:p>
     <w:p>
       <w:pPr>
-        <w:spacing w:after="120" w:line="276"/>
+        <w:spacing w:after="100" w:line="259"/>
       </w:pPr>
       <w:r>
         <w:t xml:space="preserve">Interviews are rare, but if you get one, your answers must match your documents exactly. Keep each answer short: 2 or 3 sentences. Practise answering questions 1, 2 and 11 in Spanish.</w:t>
@@ -9831,8 +9831,8 @@
     <w:rPrDefault>
       <w:rPr>
         <w:rFonts w:ascii="Arial" w:cs="Arial" w:eastAsia="Arial" w:hAnsi="Arial"/>
-        <w:sz w:val="21"/>
-        <w:szCs w:val="21"/>
+        <w:sz w:val="20"/>
+        <w:szCs w:val="20"/>
       </w:rPr>
     </w:rPrDefault>
     <w:pPrDefault/>

</xml_diff>

<commit_message>
Mark flight reservation and accommodation as optional
The embassy's study-visa list requires neither; the 3-month
accommodation rule comes only from the agency checklist. One month of
paid accommodation is enough, and a flight reservation is optional.

Co-Authored-By: Claude Opus 5.5 <noreply@anthropic.com>
Claude-Session: https://claude.ai/code/session_01V65qP6GbsGseVCeoryzkZe
</commit_message>
<xml_diff>
--- a/visa-dossier/Dossier_Visa_Espagne.docx
+++ b/visa-dossier/Dossier_Visa_Espagne.docx
@@ -1589,6 +1589,56 @@
       </w:r>
       <w:r>
         <w:t xml:space="preserve">, which satisfies both.</w:t>
+      </w:r>
+    </w:p>
+    <w:p>
+      <w:pPr>
+        <w:pStyle w:val="ListParagraph"/>
+        <w:numPr>
+          <w:ilvl w:val="0"/>
+          <w:numId w:val="2"/>
+        </w:numPr>
+        <w:spacing w:after="60"/>
+      </w:pPr>
+      <w:r>
+        <w:rPr>
+          <w:b/>
+          <w:bCs/>
+        </w:rPr>
+        <w:t xml:space="preserve">Flight and accommodation.</w:t>
+      </w:r>
+      <w:r>
+        <w:t xml:space="preserve"> The embassy requires </w:t>
+      </w:r>
+      <w:r>
+        <w:rPr>
+          <w:b/>
+          <w:bCs/>
+        </w:rPr>
+        <w:t xml:space="preserve">neither</w:t>
+      </w:r>
+      <w:r>
+        <w:t xml:space="preserve">. The agency asks for a return flight reservation and 3 months of paid accommodation; the group lists the flight as optional. </w:t>
+      </w:r>
+      <w:r>
+        <w:rPr>
+          <w:b/>
+          <w:bCs/>
+        </w:rPr>
+        <w:t xml:space="preserve">A flight reservation is optional:</w:t>
+      </w:r>
+      <w:r>
+        <w:t xml:space="preserve"> a simple reservation is enough, and don’t buy the ticket before you have the visa. </w:t>
+      </w:r>
+      <w:r>
+        <w:rPr>
+          <w:b/>
+          <w:bCs/>
+        </w:rPr>
+        <w:t xml:space="preserve">One month of paid accommodation is enough</w:t>
+      </w:r>
+      <w:r>
+        <w:t xml:space="preserve"> to show where you will live when you arrive. Only accommodation prepaid for the whole stay reduces the amount of money you must show.</w:t>
       </w:r>
     </w:p>
     <w:p>
@@ -4756,7 +4806,7 @@
                 <w:sz w:val="19"/>
                 <w:szCs w:val="19"/>
               </w:rPr>
-              <w:t xml:space="preserve">Hébergement (au moins 3 mois) + preuve de paiement ; date d’entrée = date du vol</w:t>
+              <w:t xml:space="preserve">Hébergement (facultatif) : réservation + preuve de paiement ; 1 mois suffit (l’agence conseille 3 mois) ; date d’entrée = date d’arrivée</w:t>
             </w:r>
           </w:p>
         </w:tc>
@@ -4932,7 +4982,7 @@
                 <w:sz w:val="19"/>
                 <w:szCs w:val="19"/>
               </w:rPr>
-              <w:t xml:space="preserve">Réservation de billet d’avion aller-retour</w:t>
+              <w:t xml:space="preserve">Réservation de vol (facultatif, non exigé par l’ambassade ; ne pas acheter le billet avant le visa)</w:t>
             </w:r>
           </w:p>
         </w:tc>
@@ -7421,7 +7471,19 @@
         <w:spacing w:after="60"/>
       </w:pPr>
       <w:r>
-        <w:t xml:space="preserve">Justificante de alojamiento y de su pago.</w:t>
+        <w:t xml:space="preserve">Justificante del abono de la tasa de visado.</w:t>
+      </w:r>
+    </w:p>
+    <w:p>
+      <w:pPr>
+        <w:spacing w:after="40" w:line="259"/>
+      </w:pPr>
+      <w:r>
+        <w:rPr>
+          <w:b/>
+          <w:bCs/>
+        </w:rPr>
+        <w:t xml:space="preserve">Documentación complementaria</w:t>
       </w:r>
     </w:p>
     <w:p>
@@ -7434,7 +7496,7 @@
         <w:spacing w:after="60"/>
       </w:pPr>
       <w:r>
-        <w:t xml:space="preserve">Reserva de billete de avión de ida y vuelta.</w:t>
+        <w:t xml:space="preserve">Carta de motivación.</w:t>
       </w:r>
     </w:p>
     <w:p>
@@ -7447,19 +7509,7 @@
         <w:spacing w:after="60"/>
       </w:pPr>
       <w:r>
-        <w:t xml:space="preserve">Justificante del abono de la tasa de visado.</w:t>
-      </w:r>
-    </w:p>
-    <w:p>
-      <w:pPr>
-        <w:spacing w:after="40" w:line="259"/>
-      </w:pPr>
-      <w:r>
-        <w:rPr>
-          <w:b/>
-          <w:bCs/>
-        </w:rPr>
-        <w:t xml:space="preserve">Documentación complementaria</w:t>
+        <w:t xml:space="preserve">Títulos y expedientes académicos, apostillados y traducidos.</w:t>
       </w:r>
     </w:p>
     <w:p>
@@ -7472,7 +7522,7 @@
         <w:spacing w:after="60"/>
       </w:pPr>
       <w:r>
-        <w:t xml:space="preserve">Carta de motivación.</w:t>
+        <w:t xml:space="preserve">Certificados de prácticas y de trabajo, traducidos.</w:t>
       </w:r>
     </w:p>
     <w:p>
@@ -7485,7 +7535,7 @@
         <w:spacing w:after="60"/>
       </w:pPr>
       <w:r>
-        <w:t xml:space="preserve">Títulos y expedientes académicos, apostillados y traducidos.</w:t>
+        <w:t xml:space="preserve">Justificante del nivel actual de español.</w:t>
       </w:r>
     </w:p>
     <w:p>
@@ -7498,7 +7548,7 @@
         <w:spacing w:after="60"/>
       </w:pPr>
       <w:r>
-        <w:t xml:space="preserve">Certificados de prácticas y de trabajo, traducidos.</w:t>
+        <w:t xml:space="preserve">Información de los másteres objetivo.</w:t>
       </w:r>
     </w:p>
     <w:p>
@@ -7511,7 +7561,16 @@
         <w:spacing w:after="60"/>
       </w:pPr>
       <w:r>
-        <w:t xml:space="preserve">Justificante del nivel actual de español.</w:t>
+        <w:t xml:space="preserve">Reserva de alojamiento </w:t>
+      </w:r>
+      <w:r>
+        <w:rPr>
+          <w:highlight w:val="yellow"/>
+        </w:rPr>
+        <w:t xml:space="preserve">[para el primer mes]</w:t>
+      </w:r>
+      <w:r>
+        <w:t xml:space="preserve"> y justificante de pago.</w:t>
       </w:r>
     </w:p>
     <w:p>
@@ -7524,7 +7583,7 @@
         <w:spacing w:after="60"/>
       </w:pPr>
       <w:r>
-        <w:t xml:space="preserve">Información de los másteres objetivo.</w:t>
+        <w:t xml:space="preserve">Reserva de vuelo.</w:t>
       </w:r>
     </w:p>
     <w:p>
@@ -9365,7 +9424,7 @@
         <w:t xml:space="preserve">☐  </w:t>
       </w:r>
       <w:r>
-        <w:t xml:space="preserve">The course dates match on the form, school letter, insurance, accommodation, flight and sponsorship letter.</w:t>
+        <w:t xml:space="preserve">The dates match on the form, school letter, insurance, sponsorship letter, and the accommodation and flight reservations if I include them.</w:t>
       </w:r>
     </w:p>
     <w:p>

</xml_diff>

<commit_message>
Clarify diplomas and internship certificates in the checklist
Bac and university diplomas with all transcripts: translation plus
apostille on original and translation, attestation de réussite if the
diploma is not issued yet. Internship/work certificates: translation
only (private documents), on letterhead with dates and tasks.

Co-Authored-By: Claude Opus 5.5 <noreply@anthropic.com>
Claude-Session: https://claude.ai/code/session_01V65qP6GbsGseVCeoryzkZe
</commit_message>
<xml_diff>
--- a/visa-dossier/Dossier_Visa_Espagne.docx
+++ b/visa-dossier/Dossier_Visa_Espagne.docx
@@ -5158,7 +5158,7 @@
                 <w:sz w:val="19"/>
                 <w:szCs w:val="19"/>
               </w:rPr>
-              <w:t xml:space="preserve">Diplômes + relevés de notes (bac, licence, etc.)</w:t>
+              <w:t xml:space="preserve">Bac (diplôme + relevé) et diplôme universitaire (ou attestation de réussite) + TOUS les relevés de notes ; apostille sur l’original et sur la traduction</w:t>
             </w:r>
           </w:p>
         </w:tc>
@@ -5334,7 +5334,7 @@
                 <w:sz w:val="19"/>
                 <w:szCs w:val="19"/>
               </w:rPr>
-              <w:t xml:space="preserve">Attestations de stage / de travail</w:t>
+              <w:t xml:space="preserve">Attestations de stage / de travail : papier à en-tête, signées et cachetées, avec dates et missions</w:t>
             </w:r>
           </w:p>
         </w:tc>
@@ -5392,7 +5392,7 @@
                 <w:sz w:val="19"/>
                 <w:szCs w:val="19"/>
               </w:rPr>
-              <w:t xml:space="preserve">Conseillé</w:t>
+              <w:t xml:space="preserve">Non</w:t>
             </w:r>
           </w:p>
         </w:tc>

</xml_diff>